<commit_message>
Rework chapter 6 summary: headings with paragraphs, no diacritics
Each idea now has its own heading with a paragraph below and an optional
comment in parentheses; tightened wording to fit about a page and a half.

Co-Authored-By: Claude Opus 5.5 <noreply@anthropic.com>
Claude-Session: https://claude.ai/code/session_01HrnF9isF9ZvY7NLktWJodc
</commit_message>
<xml_diff>
--- a/chapter6-summary.docx
+++ b/chapter6-summary.docx
@@ -12,438 +12,464 @@
         <w:rPr>
           <w:rFonts w:ascii="Traditional Arabic" w:hAnsi="Traditional Arabic" w:cs="Traditional Arabic" w:eastAsia="Traditional Arabic"/>
           <w:b/>
-          <w:sz w:val="36"/>
+          <w:sz w:val="34"/>
           <w:rtl w:val="1"/>
-          <w:szCs w:val="36"/>
+          <w:szCs w:val="34"/>
           <w:bCs/>
         </w:rPr>
-        <w:t>الفصل السادس: المسؤولية الخلقية للعالِم</w:t>
+        <w:t>الفصل السادس: المسؤولية الخلقية للعالم</w:t>
       </w:r>
     </w:p>
     <w:p>
       <w:pPr>
         <w:bidi w:val="1"/>
-        <w:spacing w:after="160"/>
+        <w:spacing w:after="120"/>
         <w:jc w:val="center"/>
       </w:pPr>
       <w:r>
         <w:rPr>
           <w:rFonts w:ascii="Traditional Arabic" w:hAnsi="Traditional Arabic" w:cs="Traditional Arabic" w:eastAsia="Traditional Arabic"/>
           <w:color w:val="555555"/>
-          <w:sz w:val="26"/>
+          <w:sz w:val="24"/>
           <w:rtl w:val="1"/>
-          <w:szCs w:val="26"/>
+          <w:szCs w:val="24"/>
         </w:rPr>
         <w:t>كارل بوبر – أسطورة الإطار</w:t>
       </w:r>
     </w:p>
     <w:p>
       <w:pPr>
+        <w:keepNext/>
         <w:bidi w:val="1"/>
-        <w:spacing w:after="60" w:line="240" w:lineRule="auto"/>
+        <w:spacing w:before="60" w:after="0" w:line="216" w:lineRule="auto"/>
+        <w:jc w:val="right"/>
+      </w:pPr>
+      <w:r>
+        <w:rPr>
+          <w:rFonts w:ascii="Traditional Arabic" w:hAnsi="Traditional Arabic" w:cs="Traditional Arabic" w:eastAsia="Traditional Arabic"/>
+          <w:b/>
+          <w:color w:val="7A2E1F"/>
+          <w:sz w:val="28"/>
+          <w:rtl w:val="1"/>
+          <w:szCs w:val="28"/>
+          <w:bCs/>
+        </w:rPr>
+        <w:t>قارب يركبه الجميع</w:t>
+      </w:r>
+    </w:p>
+    <w:p>
+      <w:pPr>
+        <w:bidi w:val="1"/>
+        <w:spacing w:after="40" w:line="240" w:lineRule="auto"/>
         <w:jc w:val="both"/>
       </w:pPr>
       <w:r>
         <w:rPr>
           <w:rFonts w:ascii="Traditional Arabic" w:hAnsi="Traditional Arabic" w:cs="Traditional Arabic" w:eastAsia="Traditional Arabic"/>
+          <w:sz w:val="26"/>
+          <w:rtl w:val="1"/>
+          <w:szCs w:val="26"/>
+        </w:rPr>
+        <w:t xml:space="preserve">لم يكن الموضوع من اختيار بوبر، بل فرضه عليه منظمو المؤتمر، ولم يزعم أنه يملك له حلا، لكنه قبل الدعوة إيمانا منه بأن المسؤولية الخلقية للعالم قارب يركبه الجميع وإن تفاوتت مقاعدهم فيه. والعنوان ليس إلا ستارا مهذبا يخفي شبح الحرب النووية والبيولوجية، لكنه يأبى أن يحصر الحديث فيها. </w:t>
+      </w:r>
+      <w:r>
+        <w:rPr>
+          <w:rFonts w:ascii="Traditional Arabic" w:hAnsi="Traditional Arabic" w:cs="Traditional Arabic" w:eastAsia="Traditional Arabic"/>
+          <w:color w:val="1F5F8B"/>
+          <w:sz w:val="26"/>
+          <w:rtl w:val="1"/>
+          <w:szCs w:val="26"/>
+        </w:rPr>
+        <w:t>(بداية متواضعة، لكنها تفتح الباب على مصراعيه)</w:t>
+      </w:r>
+    </w:p>
+    <w:p>
+      <w:pPr>
+        <w:keepNext/>
+        <w:bidi w:val="1"/>
+        <w:spacing w:before="60" w:after="0" w:line="216" w:lineRule="auto"/>
+        <w:jc w:val="right"/>
+      </w:pPr>
+      <w:r>
+        <w:rPr>
+          <w:rFonts w:ascii="Traditional Arabic" w:hAnsi="Traditional Arabic" w:cs="Traditional Arabic" w:eastAsia="Traditional Arabic"/>
           <w:b/>
+          <w:color w:val="7A2E1F"/>
           <w:sz w:val="28"/>
           <w:rtl w:val="1"/>
           <w:szCs w:val="28"/>
           <w:bCs/>
         </w:rPr>
-        <w:t xml:space="preserve">مدخل: </w:t>
+        <w:t>حين صار كل علم تطبيقيا</w:t>
       </w:r>
+    </w:p>
+    <w:p>
+      <w:pPr>
+        <w:bidi w:val="1"/>
+        <w:spacing w:after="40" w:line="240" w:lineRule="auto"/>
+        <w:jc w:val="both"/>
+      </w:pPr>
       <w:r>
         <w:rPr>
           <w:rFonts w:ascii="Traditional Arabic" w:hAnsi="Traditional Arabic" w:cs="Traditional Arabic" w:eastAsia="Traditional Arabic"/>
-          <w:sz w:val="28"/>
+          <w:sz w:val="26"/>
           <w:rtl w:val="1"/>
-          <w:szCs w:val="28"/>
+          <w:szCs w:val="26"/>
         </w:rPr>
-        <w:t xml:space="preserve">الموضوع لم يكن من اختيار بوبر، ولا يدّعي امتلاك حلول له، لكنه قبل الحديث لأن المسؤولية الخلقية للعالِم «قارب نركبه جميعاً» بدرجات متفاوتة. والعنوان تعبير مهذّب عن الحرب النووية والبيولوجية، لكنه سيوسّع النظر أبعد منها. </w:t>
+        <w:t xml:space="preserve">كان العالم البحت فيما مضى لا يحمل إلا أمانة واحدة هي البحث عن الحقيقة، فلم يخطر لماكسويل ولا لهيرتز أن معادلاتهما ستغادر الورق إلى الواقع. أما اليوم فقد سقط هذا الحاجز، فصار كل علم بحت مشروع تطبيق، وكل تحصيل علمي بابا من أبواب المسؤولية. </w:t>
       </w:r>
       <w:r>
         <w:rPr>
           <w:rFonts w:ascii="Traditional Arabic" w:hAnsi="Traditional Arabic" w:cs="Traditional Arabic" w:eastAsia="Traditional Arabic"/>
           <w:color w:val="1F5F8B"/>
+          <w:sz w:val="26"/>
+          <w:rtl w:val="1"/>
+          <w:szCs w:val="26"/>
+        </w:rPr>
+        <w:t>(يعني ما عاد أحد يقدر يقول: أنا مجرد باحث)</w:t>
+      </w:r>
+    </w:p>
+    <w:p>
+      <w:pPr>
+        <w:keepNext/>
+        <w:bidi w:val="1"/>
+        <w:spacing w:before="60" w:after="0" w:line="216" w:lineRule="auto"/>
+        <w:jc w:val="right"/>
+      </w:pPr>
+      <w:r>
+        <w:rPr>
+          <w:rFonts w:ascii="Traditional Arabic" w:hAnsi="Traditional Arabic" w:cs="Traditional Arabic" w:eastAsia="Traditional Arabic"/>
+          <w:b/>
+          <w:color w:val="7A2E1F"/>
           <w:sz w:val="28"/>
           <w:rtl w:val="1"/>
           <w:szCs w:val="28"/>
+          <w:bCs/>
         </w:rPr>
-        <w:t>(يعني: ما عندي الحل، بس المسؤولية على الكل)</w:t>
+        <w:t>قسم أبقراط في ثوب جديد</w:t>
       </w:r>
     </w:p>
     <w:p>
       <w:pPr>
         <w:bidi w:val="1"/>
-        <w:spacing w:after="60" w:line="240" w:lineRule="auto"/>
+        <w:spacing w:after="40" w:line="240" w:lineRule="auto"/>
         <w:jc w:val="both"/>
       </w:pPr>
       <w:r>
         <w:rPr>
           <w:rFonts w:ascii="Traditional Arabic" w:hAnsi="Traditional Arabic" w:cs="Traditional Arabic" w:eastAsia="Traditional Arabic"/>
+          <w:sz w:val="26"/>
+          <w:rtl w:val="1"/>
+          <w:szCs w:val="26"/>
+        </w:rPr>
+        <w:t xml:space="preserve">يعود بوبر إلى قسم أبقراط، عهد الطبيب المبتدئ بالوفاء لمعلمه وصون صنعته وحرمة الحياة وأسرار المرضى. ولأن القسم وضع أصلا للطالب، يقترح أن نصوغ مع طلابنا – لا أن نفرض عليهم – قسما حديثا للعلماء يقوم على ثلاثة أركان: مسؤولية مهنية تجعل الحقيقة غاية وتعد الخطأ احتمالا قائما في كل عقل مهما عظم، فلا ننسى أن معرفتنا محدودة وجهلنا بلا حدود؛ وانتماء إلى تقليد علمي يدين له الطالب بالوفاء دون أن يتخلى عن نقد غيره ونقد نفسه قبل ذلك، متجنبا الغطرسة ومجاراة الموضات الفكرية؛ ثم ولاء أعلى للإنسانية جمعاء يلزمه أن يستبصر أخطار نتائجه ويسعى لمنع سوء استخدامها، وإن لم يكن هو من يطبقها. </w:t>
+      </w:r>
+      <w:r>
+        <w:rPr>
+          <w:rFonts w:ascii="Traditional Arabic" w:hAnsi="Traditional Arabic" w:cs="Traditional Arabic" w:eastAsia="Traditional Arabic"/>
+          <w:color w:val="1F5F8B"/>
+          <w:sz w:val="26"/>
+          <w:rtl w:val="1"/>
+          <w:szCs w:val="26"/>
+        </w:rPr>
+        <w:t>(الركن الثالث هو قلب الفصل: المسؤولية ما تنتهي عند باب المختبر)</w:t>
+      </w:r>
+    </w:p>
+    <w:p>
+      <w:pPr>
+        <w:keepNext/>
+        <w:bidi w:val="1"/>
+        <w:spacing w:before="60" w:after="0" w:line="216" w:lineRule="auto"/>
+        <w:jc w:val="right"/>
+      </w:pPr>
+      <w:r>
+        <w:rPr>
+          <w:rFonts w:ascii="Traditional Arabic" w:hAnsi="Traditional Arabic" w:cs="Traditional Arabic" w:eastAsia="Traditional Arabic"/>
           <w:b/>
+          <w:color w:val="7A2E1F"/>
           <w:sz w:val="28"/>
           <w:rtl w:val="1"/>
           <w:szCs w:val="28"/>
           <w:bCs/>
         </w:rPr>
-        <w:t xml:space="preserve">من العلم البحت إلى التطبيقي: </w:t>
+        <w:t>متخصصون بلا مشكلة</w:t>
       </w:r>
+    </w:p>
+    <w:p>
+      <w:pPr>
+        <w:bidi w:val="1"/>
+        <w:spacing w:after="40" w:line="240" w:lineRule="auto"/>
+        <w:jc w:val="both"/>
+      </w:pPr>
       <w:r>
         <w:rPr>
           <w:rFonts w:ascii="Traditional Arabic" w:hAnsi="Traditional Arabic" w:cs="Traditional Arabic" w:eastAsia="Traditional Arabic"/>
+          <w:sz w:val="26"/>
+          <w:rtl w:val="1"/>
+          <w:szCs w:val="26"/>
+        </w:rPr>
+        <w:t>ويربط بوبر ذلك بأزمة الجامعات عام ١٩٦٨، حين صار طلبة الدكتوراه يدربون على قياسات تخصصية لا يعرفون المشكلة الكبرى التي تخدمها، وهو موقف يراه غير مسؤول؛ فمهمة المعلم أن يأخذ بيد طالبه إلى صميم التقليد ويريه المشكلات الكبرى. ويحذر من أن يتحول القسم إلى «أخلاقيات مهنة» تحمي الزملاء بدل أن تحمي الناس.</w:t>
+      </w:r>
+    </w:p>
+    <w:p>
+      <w:pPr>
+        <w:keepNext/>
+        <w:bidi w:val="1"/>
+        <w:spacing w:before="60" w:after="0" w:line="216" w:lineRule="auto"/>
+        <w:jc w:val="right"/>
+      </w:pPr>
+      <w:r>
+        <w:rPr>
+          <w:rFonts w:ascii="Traditional Arabic" w:hAnsi="Traditional Arabic" w:cs="Traditional Arabic" w:eastAsia="Traditional Arabic"/>
+          <w:b/>
+          <w:color w:val="7A2E1F"/>
           <w:sz w:val="28"/>
           <w:rtl w:val="1"/>
           <w:szCs w:val="28"/>
+          <w:bCs/>
         </w:rPr>
-        <w:t xml:space="preserve">كان العالِم البحت مسؤولاً فقط عن البحث عن الحقيقة؛ فماكسويل وهيرتز لم يتخيلا تطبيق معادلاتهما. أما اليوم فكل علم بحت يمكن أن يصبح تطبيقياً، فصارت المسؤولية مسألة الجميع. </w:t>
+        <w:t>تخفيف الألم قبل صناعة السعادة</w:t>
+      </w:r>
+    </w:p>
+    <w:p>
+      <w:pPr>
+        <w:bidi w:val="1"/>
+        <w:spacing w:after="40" w:line="240" w:lineRule="auto"/>
+        <w:jc w:val="both"/>
+      </w:pPr>
+      <w:r>
+        <w:rPr>
+          <w:rFonts w:ascii="Traditional Arabic" w:hAnsi="Traditional Arabic" w:cs="Traditional Arabic" w:eastAsia="Traditional Arabic"/>
+          <w:sz w:val="26"/>
+          <w:rtl w:val="1"/>
+          <w:szCs w:val="26"/>
+        </w:rPr>
+        <w:t xml:space="preserve">يرى بوبر أن السياسة العامة ينبغي أن تبدأ بتجنب المعاناة التي يمكن تجنبها، لا بتعظيم السعادة؛ فالسعادة شأن يترك لمبادرات الأفراد، أما البؤس الممكن دفعه فمسؤولية عامة. ولا يجعل ذلك المبدأ الأخلاقي الأعلى، لكنه المرشد الأصدق لترتيب الأولويات. </w:t>
       </w:r>
       <w:r>
         <w:rPr>
           <w:rFonts w:ascii="Traditional Arabic" w:hAnsi="Traditional Arabic" w:cs="Traditional Arabic" w:eastAsia="Traditional Arabic"/>
           <w:color w:val="1F5F8B"/>
+          <w:sz w:val="26"/>
+          <w:rtl w:val="1"/>
+          <w:szCs w:val="26"/>
+        </w:rPr>
+        <w:t>(فكرة عميقة: الأولى أن نخفف الألم قبل أن نعد الناس بالسعادة)</w:t>
+      </w:r>
+    </w:p>
+    <w:p>
+      <w:pPr>
+        <w:keepNext/>
+        <w:bidi w:val="1"/>
+        <w:spacing w:before="60" w:after="0" w:line="216" w:lineRule="auto"/>
+        <w:jc w:val="right"/>
+      </w:pPr>
+      <w:r>
+        <w:rPr>
+          <w:rFonts w:ascii="Traditional Arabic" w:hAnsi="Traditional Arabic" w:cs="Traditional Arabic" w:eastAsia="Traditional Arabic"/>
+          <w:b/>
+          <w:color w:val="7A2E1F"/>
           <w:sz w:val="28"/>
           <w:rtl w:val="1"/>
           <w:szCs w:val="28"/>
+          <w:bCs/>
         </w:rPr>
-        <w:t>(الزمن اللي العالِم يبحث وبس انتهى)</w:t>
+        <w:t>بين الحرب والطغيان</w:t>
       </w:r>
     </w:p>
     <w:p>
       <w:pPr>
         <w:bidi w:val="1"/>
-        <w:spacing w:after="60" w:line="240" w:lineRule="auto"/>
+        <w:spacing w:after="40" w:line="240" w:lineRule="auto"/>
         <w:jc w:val="both"/>
       </w:pPr>
       <w:r>
         <w:rPr>
           <w:rFonts w:ascii="Traditional Arabic" w:hAnsi="Traditional Arabic" w:cs="Traditional Arabic" w:eastAsia="Traditional Arabic"/>
+          <w:sz w:val="26"/>
+          <w:rtl w:val="1"/>
+          <w:szCs w:val="26"/>
+        </w:rPr>
+        <w:t xml:space="preserve">تجنب الحرب عند بوبر أشد مشكلات العصر إلحاحا، ولا بد من رفض صريح لعبادة العنف التي تتسلل إلينا عبر قصص الجريمة وأفلام الغرب الأمريكي. والخطر لا يأتي من العدوان وحده، بل من الخوف منه أيضا. غير أن للمشكلة وجها آخر، إذ «لا مشكلة تباري في إلحاحها مشكلة تفادي الحروب إلا مشكلة تفادي الطغيان»؛ ولهذا يرفض نزع السلاح من جانب واحد، ويقر بأن الردع هو ما حال حتى الآن دون الحرب النووية. أما قنبلة اليابان فسؤال عسير، وخطأ العلماء أنهم لم يصروا على قصرها على أهداف عسكرية خالصة. </w:t>
+      </w:r>
+      <w:r>
+        <w:rPr>
+          <w:rFonts w:ascii="Traditional Arabic" w:hAnsi="Traditional Arabic" w:cs="Traditional Arabic" w:eastAsia="Traditional Arabic"/>
+          <w:color w:val="1F5F8B"/>
+          <w:sz w:val="26"/>
+          <w:rtl w:val="1"/>
+          <w:szCs w:val="26"/>
+        </w:rPr>
+        <w:t>(هنا بوبر واقعي، لا يحلم بسلام بلا ثمن)</w:t>
+      </w:r>
+    </w:p>
+    <w:p>
+      <w:pPr>
+        <w:keepNext/>
+        <w:bidi w:val="1"/>
+        <w:spacing w:before="60" w:after="0" w:line="216" w:lineRule="auto"/>
+        <w:jc w:val="right"/>
+      </w:pPr>
+      <w:r>
+        <w:rPr>
+          <w:rFonts w:ascii="Traditional Arabic" w:hAnsi="Traditional Arabic" w:cs="Traditional Arabic" w:eastAsia="Traditional Arabic"/>
           <w:b/>
+          <w:color w:val="7A2E1F"/>
           <w:sz w:val="28"/>
           <w:rtl w:val="1"/>
           <w:szCs w:val="28"/>
           <w:bCs/>
         </w:rPr>
-        <w:t xml:space="preserve">قسم أبقراط وصيغته الحديثة: </w:t>
-      </w:r>
-      <w:r>
-        <w:rPr>
-          <w:rFonts w:ascii="Traditional Arabic" w:hAnsi="Traditional Arabic" w:cs="Traditional Arabic" w:eastAsia="Traditional Arabic"/>
-          <w:sz w:val="28"/>
-          <w:rtl w:val="1"/>
-          <w:szCs w:val="28"/>
-        </w:rPr>
-        <w:t>قسم أبقراط موجَّه أصلاً للمبتدئ: التزام نحو المعلم، وصون تقاليد الصنعة وحرمة الحياة، وعون المريض وحفظ سرّه. ويقترح بوبر أن نصوغ مع طلابنا – لا أن نفرض عليهم – قسماً حديثاً يقوم على ثلاث أفكار:</w:t>
+        <w:t>الضمير فوق الأمر</w:t>
       </w:r>
     </w:p>
     <w:p>
       <w:pPr>
         <w:bidi w:val="1"/>
-        <w:spacing w:after="60" w:line="240" w:lineRule="auto"/>
-        <w:ind w:right="340"/>
+        <w:spacing w:after="40" w:line="240" w:lineRule="auto"/>
         <w:jc w:val="both"/>
       </w:pPr>
       <w:r>
         <w:rPr>
           <w:rFonts w:ascii="Traditional Arabic" w:hAnsi="Traditional Arabic" w:cs="Traditional Arabic" w:eastAsia="Traditional Arabic"/>
+          <w:sz w:val="26"/>
+          <w:rtl w:val="1"/>
+          <w:szCs w:val="26"/>
+        </w:rPr>
+        <w:t>حتى الحرب العادلة لا تنجو من الجرائم، وقد أرست محاكمات نورمبرغ أن الضمير هو الحكم الأخير، فلا عذر لمن يقول: كنت أنفذ الأوامر، ومن هنا وجب احترام حق المعترض بضميره، عالما كان أم جنديا.</w:t>
+      </w:r>
+    </w:p>
+    <w:p>
+      <w:pPr>
+        <w:keepNext/>
+        <w:bidi w:val="1"/>
+        <w:spacing w:before="60" w:after="0" w:line="216" w:lineRule="auto"/>
+        <w:jc w:val="right"/>
+      </w:pPr>
+      <w:r>
+        <w:rPr>
+          <w:rFonts w:ascii="Traditional Arabic" w:hAnsi="Traditional Arabic" w:cs="Traditional Arabic" w:eastAsia="Traditional Arabic"/>
           <w:b/>
+          <w:color w:val="7A2E1F"/>
           <w:sz w:val="28"/>
           <w:rtl w:val="1"/>
           <w:szCs w:val="28"/>
           <w:bCs/>
         </w:rPr>
-        <w:t xml:space="preserve">١. المسؤولية المهنية: </w:t>
-      </w:r>
-      <w:r>
-        <w:rPr>
-          <w:rFonts w:ascii="Traditional Arabic" w:hAnsi="Traditional Arabic" w:cs="Traditional Arabic" w:eastAsia="Traditional Arabic"/>
-          <w:sz w:val="28"/>
-          <w:rtl w:val="1"/>
-          <w:szCs w:val="28"/>
-        </w:rPr>
-        <w:t>تنمية المعرفة سعياً وراء الحقيقة، مع إدراك أن الجميع معرّض للخطأ، فنأخذ أخطاءنا بجدّية ونتذكر تناهي معرفتنا ولا تناهي جهلنا.</w:t>
+        <w:t>غطرسة طلب القوة</w:t>
       </w:r>
     </w:p>
     <w:p>
       <w:pPr>
         <w:bidi w:val="1"/>
-        <w:spacing w:after="60" w:line="240" w:lineRule="auto"/>
-        <w:ind w:right="340"/>
+        <w:spacing w:after="40" w:line="240" w:lineRule="auto"/>
         <w:jc w:val="both"/>
       </w:pPr>
       <w:r>
         <w:rPr>
           <w:rFonts w:ascii="Traditional Arabic" w:hAnsi="Traditional Arabic" w:cs="Traditional Arabic" w:eastAsia="Traditional Arabic"/>
+          <w:sz w:val="26"/>
+          <w:rtl w:val="1"/>
+          <w:szCs w:val="26"/>
+        </w:rPr>
+        <w:t xml:space="preserve">يستحضر بوبر قول أوبنهايمر إن الفيزيائيين «عرفوا الخطيئة»، ويرى أن بيكون حين قال «المعرفة قوة» قد لامس حدود الغطرسة؛ فالغطرسة ليست في امتلاك المعرفة، بل في طلبها لأجل القوة. والقوة، كما قال اللورد أكتون، تجنح إلى الإفساد، والترياق أن نعي ضآلة ما نعرف، وأن كل إضافة إلى معرفتنا تكشف لنا عالما جديدا من جهلنا. </w:t>
+      </w:r>
+      <w:r>
+        <w:rPr>
+          <w:rFonts w:ascii="Traditional Arabic" w:hAnsi="Traditional Arabic" w:cs="Traditional Arabic" w:eastAsia="Traditional Arabic"/>
+          <w:color w:val="1F5F8B"/>
+          <w:sz w:val="26"/>
+          <w:rtl w:val="1"/>
+          <w:szCs w:val="26"/>
+        </w:rPr>
+        <w:t>(أجمل ما في الفصل: كلما زاد علمك اكتشفت جهلا أكبر)</w:t>
+      </w:r>
+    </w:p>
+    <w:p>
+      <w:pPr>
+        <w:keepNext/>
+        <w:bidi w:val="1"/>
+        <w:spacing w:before="60" w:after="0" w:line="216" w:lineRule="auto"/>
+        <w:jc w:val="right"/>
+      </w:pPr>
+      <w:r>
+        <w:rPr>
+          <w:rFonts w:ascii="Traditional Arabic" w:hAnsi="Traditional Arabic" w:cs="Traditional Arabic" w:eastAsia="Traditional Arabic"/>
           <w:b/>
+          <w:color w:val="7A2E1F"/>
           <w:sz w:val="28"/>
           <w:rtl w:val="1"/>
           <w:szCs w:val="28"/>
           <w:bCs/>
         </w:rPr>
-        <w:t xml:space="preserve">٢. الطالب: </w:t>
-      </w:r>
-      <w:r>
-        <w:rPr>
-          <w:rFonts w:ascii="Traditional Arabic" w:hAnsi="Traditional Arabic" w:cs="Traditional Arabic" w:eastAsia="Traditional Arabic"/>
-          <w:sz w:val="28"/>
-          <w:rtl w:val="1"/>
-          <w:szCs w:val="28"/>
-        </w:rPr>
-        <w:t>ينتمي إلى تقليد علمي فيدين لمعلميه بالاحترام، لكنه ينقد غيره ونفسه خصوصاً، ويحذر من الغطرسة الفكرية ومجاراة الموضات مجاراة عمياء.</w:t>
+        <w:t>العلوم الاجتماعية وما لم نقصده</w:t>
       </w:r>
     </w:p>
     <w:p>
       <w:pPr>
         <w:bidi w:val="1"/>
-        <w:spacing w:after="60" w:line="240" w:lineRule="auto"/>
-        <w:ind w:right="340"/>
+        <w:spacing w:after="40" w:line="240" w:lineRule="auto"/>
         <w:jc w:val="both"/>
       </w:pPr>
       <w:r>
         <w:rPr>
           <w:rFonts w:ascii="Traditional Arabic" w:hAnsi="Traditional Arabic" w:cs="Traditional Arabic" w:eastAsia="Traditional Arabic"/>
+          <w:sz w:val="26"/>
+          <w:rtl w:val="1"/>
+          <w:szCs w:val="26"/>
+        </w:rPr>
+        <w:t>للعالم الاجتماعي مسؤولية مضاعفة لأن موضوعه هو القوة ذاتها، فعليه أن يكشف أدوات التلاعب بالجماهير ويقاومها دون أن يسقط في فخ الرقابة. والقاعدة الجامعة أن كل صاحب معرفة خاصة يحمل مسؤولية خاصة، وأخطر ما يواجهنا النواتج غير المقصودة لأفعالنا، فعلى العالم أن يتنبأ بها قدر استطاعته، وأن يدق ناقوسها منذ أولى بشائرها.</w:t>
+      </w:r>
+    </w:p>
+    <w:p>
+      <w:pPr>
+        <w:keepNext/>
+        <w:bidi w:val="1"/>
+        <w:spacing w:before="60" w:after="0" w:line="216" w:lineRule="auto"/>
+        <w:jc w:val="right"/>
+      </w:pPr>
+      <w:r>
+        <w:rPr>
+          <w:rFonts w:ascii="Traditional Arabic" w:hAnsi="Traditional Arabic" w:cs="Traditional Arabic" w:eastAsia="Traditional Arabic"/>
           <w:b/>
+          <w:color w:val="7A2E1F"/>
           <w:sz w:val="28"/>
           <w:rtl w:val="1"/>
           <w:szCs w:val="28"/>
           <w:bCs/>
         </w:rPr>
-        <w:t xml:space="preserve">٣. الالتزام الطاغي: </w:t>
+        <w:t>الخلاصة</w:t>
       </w:r>
+    </w:p>
+    <w:p>
+      <w:pPr>
+        <w:bidi w:val="1"/>
+        <w:spacing w:after="40" w:line="240" w:lineRule="auto"/>
+        <w:jc w:val="both"/>
+      </w:pPr>
       <w:r>
         <w:rPr>
           <w:rFonts w:ascii="Traditional Arabic" w:hAnsi="Traditional Arabic" w:cs="Traditional Arabic" w:eastAsia="Traditional Arabic"/>
-          <w:sz w:val="28"/>
+          <w:sz w:val="26"/>
           <w:rtl w:val="1"/>
-          <w:szCs w:val="28"/>
+          <w:szCs w:val="26"/>
         </w:rPr>
-        <w:t xml:space="preserve">ولاؤه الأعلى للإنسانية جمعاء، فعليه أن يتبصّر أخطار نتائج بحثه ويحاول منع إساءة استخدامها ولو لم يطبّقها بنفسه. </w:t>
+        <w:t xml:space="preserve">العالم ليس باحثا عن الحقيقة فحسب، بل حارس على عواقبها؛ سلاحه تواضع يعترف بالجهل، ونقد لا يستثني صاحبه، وضمير يأبى أن يكون أداة في يد القوة. </w:t>
       </w:r>
       <w:r>
         <w:rPr>
           <w:rFonts w:ascii="Traditional Arabic" w:hAnsi="Traditional Arabic" w:cs="Traditional Arabic" w:eastAsia="Traditional Arabic"/>
           <w:color w:val="1F5F8B"/>
-          <w:sz w:val="28"/>
+          <w:sz w:val="26"/>
           <w:rtl w:val="1"/>
-          <w:szCs w:val="28"/>
+          <w:szCs w:val="26"/>
         </w:rPr>
-        <w:t>(أهم بند برأيي: المسؤولية ما تنتهي عند باب المختبر)</w:t>
-      </w:r>
-    </w:p>
-    <w:p>
-      <w:pPr>
-        <w:bidi w:val="1"/>
-        <w:spacing w:after="60" w:line="240" w:lineRule="auto"/>
-        <w:jc w:val="both"/>
-      </w:pPr>
-      <w:r>
-        <w:rPr>
-          <w:rFonts w:ascii="Traditional Arabic" w:hAnsi="Traditional Arabic" w:cs="Traditional Arabic" w:eastAsia="Traditional Arabic"/>
-          <w:b/>
-          <w:sz w:val="28"/>
-          <w:rtl w:val="1"/>
-          <w:szCs w:val="28"/>
-          <w:bCs/>
-        </w:rPr>
-        <w:t xml:space="preserve">أزمة الجامعات: </w:t>
-      </w:r>
-      <w:r>
-        <w:rPr>
-          <w:rFonts w:ascii="Traditional Arabic" w:hAnsi="Traditional Arabic" w:cs="Traditional Arabic" w:eastAsia="Traditional Arabic"/>
-          <w:sz w:val="28"/>
-          <w:rtl w:val="1"/>
-          <w:szCs w:val="28"/>
-        </w:rPr>
-        <w:t>صار طلبة الدكتوراه يُدرَّبون متخصصين يُجرون قياسات دون أن يعرفوا المشكلة الأصلية، وهذا عنده موقف غير مسؤول؛ فمهمة المعلم أن يشرح للطالب المشكلات الكبرى. ويحذّر من تحويل القسم إلى «أخلاقيات مهنة» تحمي الزملاء.</w:t>
-      </w:r>
-    </w:p>
-    <w:p>
-      <w:pPr>
-        <w:bidi w:val="1"/>
-        <w:spacing w:after="60" w:line="240" w:lineRule="auto"/>
-        <w:jc w:val="both"/>
-      </w:pPr>
-      <w:r>
-        <w:rPr>
-          <w:rFonts w:ascii="Traditional Arabic" w:hAnsi="Traditional Arabic" w:cs="Traditional Arabic" w:eastAsia="Traditional Arabic"/>
-          <w:b/>
-          <w:sz w:val="28"/>
-          <w:rtl w:val="1"/>
-          <w:szCs w:val="28"/>
-          <w:bCs/>
-        </w:rPr>
-        <w:t xml:space="preserve">تخفيف المعاناة لا تعظيم السعادة: </w:t>
-      </w:r>
-      <w:r>
-        <w:rPr>
-          <w:rFonts w:ascii="Traditional Arabic" w:hAnsi="Traditional Arabic" w:cs="Traditional Arabic" w:eastAsia="Traditional Arabic"/>
-          <w:sz w:val="28"/>
-          <w:rtl w:val="1"/>
-          <w:szCs w:val="28"/>
-        </w:rPr>
-        <w:t>أولوية السياسة العامة تجنّب المعاناة الممكن تجنّبها، أما السعادة فتُترك للمبادرات الشخصية، دون أن يكون هذا «المبدأ الأخلاقي الأعلى».</w:t>
-      </w:r>
-    </w:p>
-    <w:p>
-      <w:pPr>
-        <w:bidi w:val="1"/>
-        <w:spacing w:after="60" w:line="240" w:lineRule="auto"/>
-        <w:jc w:val="both"/>
-      </w:pPr>
-      <w:r>
-        <w:rPr>
-          <w:rFonts w:ascii="Traditional Arabic" w:hAnsi="Traditional Arabic" w:cs="Traditional Arabic" w:eastAsia="Traditional Arabic"/>
-          <w:b/>
-          <w:sz w:val="28"/>
-          <w:rtl w:val="1"/>
-          <w:szCs w:val="28"/>
-          <w:bCs/>
-        </w:rPr>
-        <w:t xml:space="preserve">الحرب والطغيان: </w:t>
-      </w:r>
-      <w:r>
-        <w:rPr>
-          <w:rFonts w:ascii="Traditional Arabic" w:hAnsi="Traditional Arabic" w:cs="Traditional Arabic" w:eastAsia="Traditional Arabic"/>
-          <w:sz w:val="28"/>
-          <w:rtl w:val="1"/>
-          <w:szCs w:val="28"/>
-        </w:rPr>
-        <w:t xml:space="preserve">تجنّب الحرب أكثر المشكلات إلحاحاً، ويجب رفض عبادة العنف التي تروّجها وسائل الترفيه. والحروب تنشأ من الخوف من العدوان لا من العدوانية وحدها، و«لا مشكلة تباري في إلحاحها مشكلة تفادي الحروب إلا مشكلة تفادي الطغيان». لذلك يرفض نزع السلاح من جانب واحد ويرى أن الردع منع الحرب النووية، وخطأ علماء قنبلة اليابان أنهم لم يصرّوا على حصرها في أهداف عسكرية خالصة. </w:t>
-      </w:r>
-      <w:r>
-        <w:rPr>
-          <w:rFonts w:ascii="Traditional Arabic" w:hAnsi="Traditional Arabic" w:cs="Traditional Arabic" w:eastAsia="Traditional Arabic"/>
-          <w:color w:val="1F5F8B"/>
-          <w:sz w:val="28"/>
-          <w:rtl w:val="1"/>
-          <w:szCs w:val="28"/>
-        </w:rPr>
-        <w:t>(بوبر هنا واقعي، مو داعية سلام حالم)</w:t>
-      </w:r>
-    </w:p>
-    <w:p>
-      <w:pPr>
-        <w:bidi w:val="1"/>
-        <w:spacing w:after="60" w:line="240" w:lineRule="auto"/>
-        <w:jc w:val="both"/>
-      </w:pPr>
-      <w:r>
-        <w:rPr>
-          <w:rFonts w:ascii="Traditional Arabic" w:hAnsi="Traditional Arabic" w:cs="Traditional Arabic" w:eastAsia="Traditional Arabic"/>
-          <w:b/>
-          <w:sz w:val="28"/>
-          <w:rtl w:val="1"/>
-          <w:szCs w:val="28"/>
-          <w:bCs/>
-        </w:rPr>
-        <w:t xml:space="preserve">الضمير: </w:t>
-      </w:r>
-      <w:r>
-        <w:rPr>
-          <w:rFonts w:ascii="Traditional Arabic" w:hAnsi="Traditional Arabic" w:cs="Traditional Arabic" w:eastAsia="Traditional Arabic"/>
-          <w:sz w:val="28"/>
-          <w:rtl w:val="1"/>
-          <w:szCs w:val="28"/>
-        </w:rPr>
-        <w:t>حتى الحرب العادلة لا تخلو من جرائم، ومحاكمات نورمبرغ جعلت ضمير الفرد المرجع الأخير، فلا عذر بـ«طاعة الأوامر»، ومن هنا يجب احترام حق المعترض الحي الضمير، عالماً كان أم جندياً.</w:t>
-      </w:r>
-    </w:p>
-    <w:p>
-      <w:pPr>
-        <w:bidi w:val="1"/>
-        <w:spacing w:after="60" w:line="240" w:lineRule="auto"/>
-        <w:jc w:val="both"/>
-      </w:pPr>
-      <w:r>
-        <w:rPr>
-          <w:rFonts w:ascii="Traditional Arabic" w:hAnsi="Traditional Arabic" w:cs="Traditional Arabic" w:eastAsia="Traditional Arabic"/>
-          <w:b/>
-          <w:sz w:val="28"/>
-          <w:rtl w:val="1"/>
-          <w:szCs w:val="28"/>
-          <w:bCs/>
-        </w:rPr>
-        <w:t xml:space="preserve">الغطرسة والقوة: </w:t>
-      </w:r>
-      <w:r>
-        <w:rPr>
-          <w:rFonts w:ascii="Traditional Arabic" w:hAnsi="Traditional Arabic" w:cs="Traditional Arabic" w:eastAsia="Traditional Arabic"/>
-          <w:sz w:val="28"/>
-          <w:rtl w:val="1"/>
-          <w:szCs w:val="28"/>
-        </w:rPr>
-        <w:t>قال أوبنهايمر إن الفيزيائيين «عرفوا الخطيئة»، وبيكون قال «المعرفة قوة». والغطرسة عند بوبر هي طلب المعرفة من أجل القوة، والقوة تجنح نحو الإفساد كما قال اللورد أكتون، والترياق هو الوعي بضآلة ما نعرفه.</w:t>
-      </w:r>
-    </w:p>
-    <w:p>
-      <w:pPr>
-        <w:bidi w:val="1"/>
-        <w:spacing w:after="60" w:line="240" w:lineRule="auto"/>
-        <w:jc w:val="both"/>
-      </w:pPr>
-      <w:r>
-        <w:rPr>
-          <w:rFonts w:ascii="Traditional Arabic" w:hAnsi="Traditional Arabic" w:cs="Traditional Arabic" w:eastAsia="Traditional Arabic"/>
-          <w:b/>
-          <w:sz w:val="28"/>
-          <w:rtl w:val="1"/>
-          <w:szCs w:val="28"/>
-          <w:bCs/>
-        </w:rPr>
-        <w:t xml:space="preserve">العلوم الاجتماعية والنواتج غير المقصودة: </w:t>
-      </w:r>
-      <w:r>
-        <w:rPr>
-          <w:rFonts w:ascii="Traditional Arabic" w:hAnsi="Traditional Arabic" w:cs="Traditional Arabic" w:eastAsia="Traditional Arabic"/>
-          <w:sz w:val="28"/>
-          <w:rtl w:val="1"/>
-          <w:szCs w:val="28"/>
-        </w:rPr>
-        <w:t>للعالِم الاجتماعي مسؤولية خاصة لأن دراسته تمسّ القوة، فعليه أن يحذّر من أدوات التلاعب بالجماهير دون الوقوع في الرقابة. وكل من يملك معرفة خاصة يحمل مسؤولية خاصة، والمشكلة الأساسية هي النواتج غير المقصودة لأفعالنا، فعلى العالِم أن يتنبأ بها وينبّه إليها منذ أولى بشائرها.</w:t>
-      </w:r>
-    </w:p>
-    <w:p>
-      <w:pPr>
-        <w:bidi w:val="1"/>
-        <w:spacing w:after="60" w:line="240" w:lineRule="auto"/>
-        <w:jc w:val="both"/>
-      </w:pPr>
-      <w:r>
-        <w:rPr>
-          <w:rFonts w:ascii="Traditional Arabic" w:hAnsi="Traditional Arabic" w:cs="Traditional Arabic" w:eastAsia="Traditional Arabic"/>
-          <w:b/>
-          <w:sz w:val="28"/>
-          <w:rtl w:val="1"/>
-          <w:szCs w:val="28"/>
-          <w:bCs/>
-        </w:rPr>
-        <w:t xml:space="preserve">الخلاصة: </w:t>
-      </w:r>
-      <w:r>
-        <w:rPr>
-          <w:rFonts w:ascii="Traditional Arabic" w:hAnsi="Traditional Arabic" w:cs="Traditional Arabic" w:eastAsia="Traditional Arabic"/>
-          <w:sz w:val="28"/>
-          <w:rtl w:val="1"/>
-          <w:szCs w:val="28"/>
-        </w:rPr>
-        <w:t xml:space="preserve">العالِم مسؤول أمام الإنسانية عن عواقب ما يكتشفه، وسلاحه التواضع والنقد الذاتي. </w:t>
-      </w:r>
-      <w:r>
-        <w:rPr>
-          <w:rFonts w:ascii="Traditional Arabic" w:hAnsi="Traditional Arabic" w:cs="Traditional Arabic" w:eastAsia="Traditional Arabic"/>
-          <w:color w:val="1F5F8B"/>
-          <w:sz w:val="28"/>
-          <w:rtl w:val="1"/>
-          <w:szCs w:val="28"/>
-        </w:rPr>
-        <w:t>(باختصار: اعرف قد إيش أنت جاهل، وفكّر في عواقب علمك قبل لا تفرح فيه)</w:t>
+        <w:t>(باختصار: اعرف حدود علمك، وفكر في عواقبه قبل أن تفرح به)</w:t>
       </w:r>
     </w:p>
     <w:sectPr>
       <w:pgSz w:w="11906" w:h="16838"/>
-      <w:pgMar w:top="1247" w:right="1304" w:bottom="1247" w:left="1304" w:header="720" w:footer="720" w:gutter="0"/>
+      <w:pgMar w:top="1134" w:right="1134" w:bottom="1134" w:left="1134" w:header="720" w:footer="720" w:gutter="0"/>
       <w:cols w:space="720"/>
       <w:docGrid w:linePitch="360"/>
       <w:bidi/>

</xml_diff>